<commit_message>
Add Global Wellness Institute figures to research summary
Co-Authored-By: Claude Opus 5.5 <noreply@anthropic.com>
Claude-Session: https://claude.ai/code/session_01WN3THeWZQW2o4KJoNbsMAq
</commit_message>
<xml_diff>
--- a/Beauty_Luxury_Wellness_Research_Summary.docx
+++ b/Beauty_Luxury_Wellness_Research_Summary.docx
@@ -503,7 +503,7 @@
           </w:tcPr>
           <w:p>
             <w:r>
-              <w:t xml:space="preserve">Global Wellness Economy Hits a Record $6.8 Trillion</w:t>
+              <w:t xml:space="preserve">Global Wellness Economy Hits a Record $6.8 Trillion (2025 Global Wellness Economy Monitor)</w:t>
             </w:r>
           </w:p>
         </w:tc>
@@ -549,7 +549,7 @@
           </w:tcPr>
           <w:p>
             <w:r>
-              <w:t xml:space="preserve">2026 (headline only reviewed)</w:t>
+              <w:t xml:space="preserve">Nov 2025</w:t>
             </w:r>
           </w:p>
         </w:tc>
@@ -572,7 +572,7 @@
           </w:tcPr>
           <w:p>
             <w:r>
-              <w:t xml:space="preserve">Wellness market size</w:t>
+              <w:t xml:space="preserve">Wellness market size &amp; forecast</w:t>
             </w:r>
           </w:p>
         </w:tc>
@@ -594,7 +594,7 @@
         <w:t xml:space="preserve">Source notes:</w:t>
       </w:r>
       <w:r>
-        <w:t xml:space="preserve"> The Global Wellness Institute file contained only the press-release title and link; the full release could not be accessed, so wellness figures come from the headline and the GWI data cited in the CNBC newsletter. The CNBC file is a forwarded newsletter that also covers art lending and family offices; those sections are summarized briefly as wealth trends.</w:t>
+        <w:t xml:space="preserve"> The Global Wellness Institute press release could not be opened directly; its figures were confirmed through web search results from GWI's own pages (press release, blog and report page). The CNBC file is a forwarded newsletter that also covers art lending and family offices; those sections are summarized briefly as wealth trends.</w:t>
       </w:r>
     </w:p>
     <w:p>
@@ -1006,27 +1006,7 @@
         <w:spacing w:after="120"/>
       </w:pPr>
       <w:r>
-        <w:t xml:space="preserve">Data points from these years, as referenced in the 2026 sources:</w:t>
-      </w:r>
-    </w:p>
-    <w:p>
-      <w:pPr>
-        <w:pStyle w:val="ListParagraph"/>
-        <w:numPr>
-          <w:ilvl w:val="0"/>
-          <w:numId w:val="2"/>
-        </w:numPr>
-        <w:spacing w:after="60"/>
-      </w:pPr>
-      <w:r>
-        <w:rPr>
-          <w:b/>
-          <w:bCs/>
-        </w:rPr>
-        <w:t xml:space="preserve">Wellness economy: $6.8T in 2024</w:t>
-      </w:r>
-      <w:r>
-        <w:t xml:space="preserve"> (GWI, per the headline and CNBC)</w:t>
+        <w:t xml:space="preserve">Data points from these years, including sources published in 2025:</w:t>
       </w:r>
     </w:p>
     <w:p>
@@ -1094,18 +1074,10 @@
     </w:p>
     <w:p>
       <w:pPr>
-        <w:pStyle w:val="Heading1"/>
-      </w:pPr>
-      <w:r>
-        <w:t xml:space="preserve">2026</w:t>
-      </w:r>
-    </w:p>
-    <w:p>
-      <w:pPr>
         <w:pStyle w:val="Heading3"/>
       </w:pPr>
       <w:r>
-        <w:t xml:space="preserve">Deloitte — Global Powers of Luxury 2026</w:t>
+        <w:t xml:space="preserve">Global Wellness Institute — 2025 Global Wellness Economy Monitor</w:t>
       </w:r>
     </w:p>
     <w:p>
@@ -1118,7 +1090,7 @@
           <w:iCs/>
           <w:color w:val="595959"/>
         </w:rPr>
-        <w:t xml:space="preserve">Survey of 420 luxury executives across 10 countries; this edition adds hospitality</w:t>
+        <w:t xml:space="preserve">Press release, November 2025</w:t>
       </w:r>
     </w:p>
     <w:p>
@@ -1133,14 +1105,44 @@
         <w:t xml:space="preserve">Overview:</w:t>
       </w:r>
       <w:r>
-        <w:t xml:space="preserve"> Deloitte's main message is that </w:t>
-      </w:r>
-      <w:r>
-        <w:rPr>
-          <w:b/>
-          <w:bCs/>
-        </w:rPr>
-        <w:t xml:space="preserve">2026 is a year of stabilization: value over volume</w:t>
+        <w:t xml:space="preserve"> The wellness economy hit a </w:t>
+      </w:r>
+      <w:r>
+        <w:rPr>
+          <w:b/>
+          <w:bCs/>
+        </w:rPr>
+        <w:t xml:space="preserve">record $6.8T in 2024</w:t>
+      </w:r>
+      <w:r>
+        <w:t xml:space="preserve">, up </w:t>
+      </w:r>
+      <w:r>
+        <w:rPr>
+          <w:b/>
+          <w:bCs/>
+        </w:rPr>
+        <w:t xml:space="preserve">7.9% from 2023</w:t>
+      </w:r>
+      <w:r>
+        <w:t xml:space="preserve">, and has </w:t>
+      </w:r>
+      <w:r>
+        <w:rPr>
+          <w:b/>
+          <w:bCs/>
+        </w:rPr>
+        <w:t xml:space="preserve">doubled since 2013</w:t>
+      </w:r>
+      <w:r>
+        <w:t xml:space="preserve">. GWI forecasts </w:t>
+      </w:r>
+      <w:r>
+        <w:rPr>
+          <w:b/>
+          <w:bCs/>
+        </w:rPr>
+        <w:t xml:space="preserve">7.6% annual growth to about $9.8T in 2029</w:t>
       </w:r>
       <w:r>
         <w:t xml:space="preserve">.</w:t>
@@ -1172,130 +1174,70 @@
           <w:b/>
           <w:bCs/>
         </w:rPr>
-        <w:t xml:space="preserve">Cautious outlook:</w:t>
-      </w:r>
-      <w:r>
-        <w:t xml:space="preserve"> 66.9% of executives expect stable or growing revenue, and 70.7% expect stable or better margins. Inflation, tariffs, and "aspirational" shoppers pulling back are the headwinds.</w:t>
-      </w:r>
-    </w:p>
-    <w:p>
-      <w:pPr>
-        <w:pStyle w:val="ListParagraph"/>
-        <w:numPr>
-          <w:ilvl w:val="0"/>
-          <w:numId w:val="2"/>
-        </w:numPr>
-        <w:spacing w:after="60"/>
-      </w:pPr>
-      <w:r>
-        <w:rPr>
-          <w:b/>
-          <w:bCs/>
-        </w:rPr>
-        <w:t xml:space="preserve">Price increases are the main lever:</w:t>
-      </w:r>
-      <w:r>
-        <w:t xml:space="preserve"> 81.2% plan price adjustments. About 36% plan capex cuts, and 39.3% plan store closures or network optimization.</w:t>
-      </w:r>
-    </w:p>
-    <w:p>
-      <w:pPr>
-        <w:pStyle w:val="ListParagraph"/>
-        <w:numPr>
-          <w:ilvl w:val="0"/>
-          <w:numId w:val="2"/>
-        </w:numPr>
-        <w:spacing w:after="60"/>
-      </w:pPr>
-      <w:r>
-        <w:rPr>
-          <w:b/>
-          <w:bCs/>
-        </w:rPr>
-        <w:t xml:space="preserve">Regional growth drivers:</w:t>
-      </w:r>
-      <w:r>
-        <w:t xml:space="preserve"> China (19.3%), Japan (19.0%, helped by a weak yen), Middle East (17.9%), and India (11.9%). North America is lagging (7.9%) because wealthy Americans are buying abroad.</w:t>
-      </w:r>
-    </w:p>
-    <w:p>
-      <w:pPr>
-        <w:pStyle w:val="ListParagraph"/>
-        <w:numPr>
-          <w:ilvl w:val="0"/>
-          <w:numId w:val="2"/>
-        </w:numPr>
-        <w:spacing w:after="60"/>
-      </w:pPr>
-      <w:r>
-        <w:rPr>
-          <w:b/>
-          <w:bCs/>
-        </w:rPr>
-        <w:t xml:space="preserve">Experiences over products:</w:t>
-      </w:r>
-      <w:r>
-        <w:t xml:space="preserve"> Travel is the fastest-growing luxury category (36.2%), ahead of beauty (18.6%)</w:t>
-      </w:r>
-    </w:p>
-    <w:p>
-      <w:pPr>
-        <w:pStyle w:val="ListParagraph"/>
-        <w:numPr>
-          <w:ilvl w:val="0"/>
-          <w:numId w:val="2"/>
-        </w:numPr>
-        <w:spacing w:after="60"/>
-      </w:pPr>
-      <w:r>
-        <w:rPr>
-          <w:b/>
-          <w:bCs/>
-        </w:rPr>
-        <w:t xml:space="preserve">AI is the top change force over 5 years</w:t>
-      </w:r>
-      <w:r>
-        <w:t xml:space="preserve"> (31.7%), followed by new materials and production methods (22.6%)</w:t>
-      </w:r>
-    </w:p>
-    <w:p>
-      <w:pPr>
-        <w:pStyle w:val="ListParagraph"/>
-        <w:numPr>
-          <w:ilvl w:val="0"/>
-          <w:numId w:val="2"/>
-        </w:numPr>
-        <w:spacing w:after="60"/>
-      </w:pPr>
-      <w:r>
-        <w:rPr>
-          <w:b/>
-          <w:bCs/>
-        </w:rPr>
-        <w:t xml:space="preserve">Regulation is driving sustainability:</w:t>
-      </w:r>
-      <w:r>
-        <w:t xml:space="preserve"> EU CSRD rules and Digital Product Passports are moving from pilots to standard practice</w:t>
-      </w:r>
-    </w:p>
-    <w:p>
-      <w:pPr>
-        <w:pStyle w:val="ListParagraph"/>
-        <w:numPr>
-          <w:ilvl w:val="0"/>
-          <w:numId w:val="2"/>
-        </w:numPr>
-        <w:spacing w:after="60"/>
-      </w:pPr>
-      <w:r>
-        <w:rPr>
-          <w:b/>
-          <w:bCs/>
-        </w:rPr>
-        <w:t xml:space="preserve">Supply chains are regionalizing</w:t>
-      </w:r>
-      <w:r>
-        <w:t xml:space="preserve"> in response to tariffs, with nearshoring in Italy and India emerging as a manufacturing hub</w:t>
+        <w:t xml:space="preserve">Growth is speeding up:</w:t>
+      </w:r>
+      <w:r>
+        <w:t xml:space="preserve"> 6.2% a year from 2019 to 2024 (35% in total), rising to a forecast 7.6% a year through 2029</w:t>
+      </w:r>
+    </w:p>
+    <w:p>
+      <w:pPr>
+        <w:pStyle w:val="ListParagraph"/>
+        <w:numPr>
+          <w:ilvl w:val="0"/>
+          <w:numId w:val="2"/>
+        </w:numPr>
+        <w:spacing w:after="60"/>
+      </w:pPr>
+      <w:r>
+        <w:rPr>
+          <w:b/>
+          <w:bCs/>
+        </w:rPr>
+        <w:t xml:space="preserve">Scale:</w:t>
+      </w:r>
+      <w:r>
+        <w:t xml:space="preserve"> almost </w:t>
+      </w:r>
+      <w:r>
+        <w:rPr>
+          <w:b/>
+          <w:bCs/>
+        </w:rPr>
+        <w:t xml:space="preserve">4x the pharmaceutical industry</w:t>
+      </w:r>
+      <w:r>
+        <w:t xml:space="preserve"> ($1.8T) and about </w:t>
+      </w:r>
+      <w:r>
+        <w:rPr>
+          <w:b/>
+          <w:bCs/>
+        </w:rPr>
+        <w:t xml:space="preserve">60% of all global health spending</w:t>
+      </w:r>
+      <w:r>
+        <w:t xml:space="preserve"> ($11.2T)</w:t>
+      </w:r>
+    </w:p>
+    <w:p>
+      <w:pPr>
+        <w:pStyle w:val="ListParagraph"/>
+        <w:numPr>
+          <w:ilvl w:val="0"/>
+          <w:numId w:val="2"/>
+        </w:numPr>
+        <w:spacing w:after="60"/>
+      </w:pPr>
+      <w:r>
+        <w:rPr>
+          <w:b/>
+          <w:bCs/>
+        </w:rPr>
+        <w:t xml:space="preserve">Fastest-growing regions (2019–2024):</w:t>
+      </w:r>
+      <w:r>
+        <w:t xml:space="preserve"> North America (7.9% a year), Middle East–North Africa (7.2%) and Europe (6.3%), which also recovered most strongly after the pandemic</w:t>
       </w:r>
     </w:p>
     <w:p>
@@ -1320,109 +1262,62 @@
         <w:spacing w:after="60"/>
       </w:pPr>
       <w:r>
-        <w:t xml:space="preserve">Hyper-personalization is the #1 consumer trend (clienteling apps, AR try-ons, CRM)</w:t>
-      </w:r>
-    </w:p>
-    <w:p>
-      <w:pPr>
-        <w:pStyle w:val="ListParagraph"/>
-        <w:numPr>
-          <w:ilvl w:val="0"/>
-          <w:numId w:val="2"/>
-        </w:numPr>
-        <w:spacing w:after="60"/>
-      </w:pPr>
-      <w:r>
-        <w:rPr>
-          <w:b/>
-          <w:bCs/>
-        </w:rPr>
-        <w:t xml:space="preserve">Resale is going mainstream:</w:t>
-      </w:r>
-      <w:r>
-        <w:t xml:space="preserve"> 68% of brands offer repair or care services and 54% certified pre-owned programs. Resale is projected at </w:t>
-      </w:r>
-      <w:r>
-        <w:rPr>
-          <w:b/>
-          <w:bCs/>
-        </w:rPr>
-        <w:t xml:space="preserve">$367B by 2029</w:t>
-      </w:r>
-      <w:r>
-        <w:t xml:space="preserve">.</w:t>
-      </w:r>
-    </w:p>
-    <w:p>
-      <w:pPr>
-        <w:pStyle w:val="ListParagraph"/>
-        <w:numPr>
-          <w:ilvl w:val="0"/>
-          <w:numId w:val="2"/>
-        </w:numPr>
-        <w:spacing w:after="60"/>
-      </w:pPr>
-      <w:r>
-        <w:t xml:space="preserve">Flagship stores are becoming "theatrical" destinations with cafés, galleries, and pop-ups</w:t>
-      </w:r>
-    </w:p>
-    <w:p>
-      <w:pPr>
-        <w:pStyle w:val="ListParagraph"/>
-        <w:numPr>
-          <w:ilvl w:val="0"/>
-          <w:numId w:val="2"/>
-        </w:numPr>
-        <w:spacing w:after="60"/>
-      </w:pPr>
-      <w:r>
-        <w:t xml:space="preserve">GenAI adoption: 41% are assessing it, 41% are piloting it, and only 12% have it embedded</w:t>
-      </w:r>
-    </w:p>
-    <w:p>
-      <w:pPr>
-        <w:pStyle w:val="ListParagraph"/>
-        <w:numPr>
-          <w:ilvl w:val="0"/>
-          <w:numId w:val="2"/>
-        </w:numPr>
-        <w:spacing w:after="60"/>
-      </w:pPr>
-      <w:r>
-        <w:t xml:space="preserve">Five-year growth levers: e-commerce/DTC (25.7%), social and shoppable commerce (20%), and lifestyle extensions into </w:t>
-      </w:r>
-      <w:r>
-        <w:rPr>
-          <w:b/>
-          <w:bCs/>
-        </w:rPr>
-        <w:t xml:space="preserve">wellness</w:t>
-      </w:r>
-      <w:r>
-        <w:t xml:space="preserve">, hospitality, and home (17.9%)</w:t>
-      </w:r>
-    </w:p>
-    <w:p>
-      <w:pPr>
-        <w:pStyle w:val="ListParagraph"/>
-        <w:numPr>
-          <w:ilvl w:val="0"/>
-          <w:numId w:val="2"/>
-        </w:numPr>
-        <w:spacing w:after="60"/>
-      </w:pPr>
-      <w:r>
-        <w:t xml:space="preserve">India: luxury beauty is about </w:t>
-      </w:r>
-      <w:r>
-        <w:rPr>
-          <w:b/>
-          <w:bCs/>
-        </w:rPr>
-        <w:t xml:space="preserve">$0.8B, projected at about $4B by 2035</w:t>
-      </w:r>
-      <w:r>
-        <w:t xml:space="preserve">, and gold jewelry remains central</w:t>
+        <w:rPr>
+          <w:b/>
+          <w:bCs/>
+        </w:rPr>
+        <w:t xml:space="preserve">Fastest-growing sectors (2019–2024):</w:t>
+      </w:r>
+      <w:r>
+        <w:t xml:space="preserve"> wellness real estate (</w:t>
+      </w:r>
+      <w:r>
+        <w:rPr>
+          <w:b/>
+          <w:bCs/>
+        </w:rPr>
+        <w:t xml:space="preserve">19.5% a year</w:t>
+      </w:r>
+      <w:r>
+        <w:t xml:space="preserve">) and mental wellness (</w:t>
+      </w:r>
+      <w:r>
+        <w:rPr>
+          <w:b/>
+          <w:bCs/>
+        </w:rPr>
+        <w:t xml:space="preserve">12.4% a year</w:t>
+      </w:r>
+      <w:r>
+        <w:t xml:space="preserve">)</w:t>
+      </w:r>
+    </w:p>
+    <w:p>
+      <w:pPr>
+        <w:pStyle w:val="ListParagraph"/>
+        <w:numPr>
+          <w:ilvl w:val="0"/>
+          <w:numId w:val="2"/>
+        </w:numPr>
+        <w:spacing w:after="60"/>
+      </w:pPr>
+      <w:r>
+        <w:rPr>
+          <w:b/>
+          <w:bCs/>
+        </w:rPr>
+        <w:t xml:space="preserve">Six sectors will pass $1T each by 2029:</w:t>
+      </w:r>
+      <w:r>
+        <w:t xml:space="preserve"> personal care &amp; beauty; healthy eating, nutrition &amp; weight loss; physical activity; wellness tourism; wellness real estate; and traditional &amp; complementary medicine</w:t>
+      </w:r>
+    </w:p>
+    <w:p>
+      <w:pPr>
+        <w:pStyle w:val="Heading1"/>
+      </w:pPr>
+      <w:r>
+        <w:t xml:space="preserve">2026</w:t>
       </w:r>
     </w:p>
     <w:p>
@@ -1430,7 +1325,7 @@
         <w:pStyle w:val="Heading3"/>
       </w:pPr>
       <w:r>
-        <w:t xml:space="preserve">CNBC Inside Wealth — "Health is the New Luxury"</w:t>
+        <w:t xml:space="preserve">Deloitte — Global Powers of Luxury 2026</w:t>
       </w:r>
     </w:p>
     <w:p>
@@ -1443,7 +1338,7 @@
           <w:iCs/>
           <w:color w:val="595959"/>
         </w:rPr>
-        <w:t xml:space="preserve">Newsletter dated February 19, 2026</w:t>
+        <w:t xml:space="preserve">Survey of 420 luxury executives across 10 countries; this edition adds hospitality</w:t>
       </w:r>
     </w:p>
     <w:p>
@@ -1458,14 +1353,14 @@
         <w:t xml:space="preserve">Overview:</w:t>
       </w:r>
       <w:r>
-        <w:t xml:space="preserve"> In an interview, Equinox's executive chairman describes the wealthy moving their spending </w:t>
-      </w:r>
-      <w:r>
-        <w:rPr>
-          <w:b/>
-          <w:bCs/>
-        </w:rPr>
-        <w:t xml:space="preserve">from status goods to health and longevity</w:t>
+        <w:t xml:space="preserve"> Deloitte's main message is that </w:t>
+      </w:r>
+      <w:r>
+        <w:rPr>
+          <w:b/>
+          <w:bCs/>
+        </w:rPr>
+        <w:t xml:space="preserve">2026 is a year of stabilization: value over volume</w:t>
       </w:r>
       <w:r>
         <w:t xml:space="preserve">.</w:t>
@@ -1497,66 +1392,130 @@
           <w:b/>
           <w:bCs/>
         </w:rPr>
-        <w:t xml:space="preserve">Wellness is forecast to reach nearly $10T by 2030</w:t>
-      </w:r>
-      <w:r>
-        <w:t xml:space="preserve"> (GWI). Growth rates by segment: longevity </w:t>
-      </w:r>
-      <w:r>
-        <w:rPr>
-          <w:b/>
-          <w:bCs/>
-        </w:rPr>
-        <w:t xml:space="preserve">11% a year</w:t>
-      </w:r>
-      <w:r>
-        <w:t xml:space="preserve">, wellness tourism 8%, nutrition 7%, physical activity 5%.</w:t>
-      </w:r>
-    </w:p>
-    <w:p>
-      <w:pPr>
-        <w:pStyle w:val="ListParagraph"/>
-        <w:numPr>
-          <w:ilvl w:val="0"/>
-          <w:numId w:val="2"/>
-        </w:numPr>
-        <w:spacing w:after="60"/>
-      </w:pPr>
-      <w:r>
-        <w:t xml:space="preserve">Wealthy people are aging and spending on longevity. 87% of Julius Baer's North American clients are taking steps to extend their lives.</w:t>
-      </w:r>
-    </w:p>
-    <w:p>
-      <w:pPr>
-        <w:pStyle w:val="ListParagraph"/>
-        <w:numPr>
-          <w:ilvl w:val="0"/>
-          <w:numId w:val="2"/>
-        </w:numPr>
-        <w:spacing w:after="60"/>
-      </w:pPr>
-      <w:r>
-        <w:t xml:space="preserve">Private banks are partnering with concierge medical practices</w:t>
-      </w:r>
-    </w:p>
-    <w:p>
-      <w:pPr>
-        <w:pStyle w:val="ListParagraph"/>
-        <w:numPr>
-          <w:ilvl w:val="0"/>
-          <w:numId w:val="2"/>
-        </w:numPr>
-        <w:spacing w:after="60"/>
-      </w:pPr>
-      <w:r>
-        <w:rPr>
-          <w:b/>
-          <w:bCs/>
-        </w:rPr>
-        <w:t xml:space="preserve">Other wealth trends:</w:t>
-      </w:r>
-      <w:r>
-        <w:t xml:space="preserve"> The art-loan market is about $38–45B, growing about 12% a year. Family offices managing $1B+ now spend an average of $6.6M a year to operate.</w:t>
+        <w:t xml:space="preserve">Cautious outlook:</w:t>
+      </w:r>
+      <w:r>
+        <w:t xml:space="preserve"> 66.9% of executives expect stable or growing revenue, and 70.7% expect stable or better margins. Inflation, tariffs, and "aspirational" shoppers pulling back are the headwinds.</w:t>
+      </w:r>
+    </w:p>
+    <w:p>
+      <w:pPr>
+        <w:pStyle w:val="ListParagraph"/>
+        <w:numPr>
+          <w:ilvl w:val="0"/>
+          <w:numId w:val="2"/>
+        </w:numPr>
+        <w:spacing w:after="60"/>
+      </w:pPr>
+      <w:r>
+        <w:rPr>
+          <w:b/>
+          <w:bCs/>
+        </w:rPr>
+        <w:t xml:space="preserve">Price increases are the main lever:</w:t>
+      </w:r>
+      <w:r>
+        <w:t xml:space="preserve"> 81.2% plan price adjustments. About 36% plan capex cuts, and 39.3% plan store closures or network optimization.</w:t>
+      </w:r>
+    </w:p>
+    <w:p>
+      <w:pPr>
+        <w:pStyle w:val="ListParagraph"/>
+        <w:numPr>
+          <w:ilvl w:val="0"/>
+          <w:numId w:val="2"/>
+        </w:numPr>
+        <w:spacing w:after="60"/>
+      </w:pPr>
+      <w:r>
+        <w:rPr>
+          <w:b/>
+          <w:bCs/>
+        </w:rPr>
+        <w:t xml:space="preserve">Regional growth drivers:</w:t>
+      </w:r>
+      <w:r>
+        <w:t xml:space="preserve"> China (19.3%), Japan (19.0%, helped by a weak yen), Middle East (17.9%), and India (11.9%). North America is lagging (7.9%) because wealthy Americans are buying abroad.</w:t>
+      </w:r>
+    </w:p>
+    <w:p>
+      <w:pPr>
+        <w:pStyle w:val="ListParagraph"/>
+        <w:numPr>
+          <w:ilvl w:val="0"/>
+          <w:numId w:val="2"/>
+        </w:numPr>
+        <w:spacing w:after="60"/>
+      </w:pPr>
+      <w:r>
+        <w:rPr>
+          <w:b/>
+          <w:bCs/>
+        </w:rPr>
+        <w:t xml:space="preserve">Experiences over products:</w:t>
+      </w:r>
+      <w:r>
+        <w:t xml:space="preserve"> Travel is the fastest-growing luxury category (36.2%), ahead of beauty (18.6%)</w:t>
+      </w:r>
+    </w:p>
+    <w:p>
+      <w:pPr>
+        <w:pStyle w:val="ListParagraph"/>
+        <w:numPr>
+          <w:ilvl w:val="0"/>
+          <w:numId w:val="2"/>
+        </w:numPr>
+        <w:spacing w:after="60"/>
+      </w:pPr>
+      <w:r>
+        <w:rPr>
+          <w:b/>
+          <w:bCs/>
+        </w:rPr>
+        <w:t xml:space="preserve">AI is the top change force over 5 years</w:t>
+      </w:r>
+      <w:r>
+        <w:t xml:space="preserve"> (31.7%), followed by new materials and production methods (22.6%)</w:t>
+      </w:r>
+    </w:p>
+    <w:p>
+      <w:pPr>
+        <w:pStyle w:val="ListParagraph"/>
+        <w:numPr>
+          <w:ilvl w:val="0"/>
+          <w:numId w:val="2"/>
+        </w:numPr>
+        <w:spacing w:after="60"/>
+      </w:pPr>
+      <w:r>
+        <w:rPr>
+          <w:b/>
+          <w:bCs/>
+        </w:rPr>
+        <w:t xml:space="preserve">Regulation is driving sustainability:</w:t>
+      </w:r>
+      <w:r>
+        <w:t xml:space="preserve"> EU CSRD rules and Digital Product Passports are moving from pilots to standard practice</w:t>
+      </w:r>
+    </w:p>
+    <w:p>
+      <w:pPr>
+        <w:pStyle w:val="ListParagraph"/>
+        <w:numPr>
+          <w:ilvl w:val="0"/>
+          <w:numId w:val="2"/>
+        </w:numPr>
+        <w:spacing w:after="60"/>
+      </w:pPr>
+      <w:r>
+        <w:rPr>
+          <w:b/>
+          <w:bCs/>
+        </w:rPr>
+        <w:t xml:space="preserve">Supply chains are regionalizing</w:t>
+      </w:r>
+      <w:r>
+        <w:t xml:space="preserve"> in response to tariffs, with nearshoring in Italy and India emerging as a manufacturing hub</w:t>
       </w:r>
     </w:p>
     <w:p>
@@ -1581,69 +1540,109 @@
         <w:spacing w:after="60"/>
       </w:pPr>
       <w:r>
-        <w:t xml:space="preserve">Equinox Optimize: $40K a year, </w:t>
-      </w:r>
-      <w:r>
-        <w:rPr>
-          <w:b/>
-          <w:bCs/>
-        </w:rPr>
-        <w:t xml:space="preserve">waitlist of 1,000+</w:t>
-      </w:r>
-      <w:r>
-        <w:t xml:space="preserve">, twice-yearly biomarker testing through Function Health</w:t>
-      </w:r>
-    </w:p>
-    <w:p>
-      <w:pPr>
-        <w:pStyle w:val="ListParagraph"/>
-        <w:numPr>
-          <w:ilvl w:val="0"/>
-          <w:numId w:val="2"/>
-        </w:numPr>
-        <w:spacing w:after="60"/>
-      </w:pPr>
-      <w:r>
-        <w:t xml:space="preserve">Its IV drip lounge is already a "seven-figure business"</w:t>
-      </w:r>
-    </w:p>
-    <w:p>
-      <w:pPr>
-        <w:pStyle w:val="ListParagraph"/>
-        <w:numPr>
-          <w:ilvl w:val="0"/>
-          <w:numId w:val="2"/>
-        </w:numPr>
-        <w:spacing w:after="60"/>
-      </w:pPr>
-      <w:r>
-        <w:t xml:space="preserve">Hospitality is expanding into wellness: about a dozen Equinox hotels planned, including Saudi Arabia, built around sleep</w:t>
-      </w:r>
-    </w:p>
-    <w:p>
-      <w:pPr>
-        <w:pStyle w:val="ListParagraph"/>
-        <w:numPr>
-          <w:ilvl w:val="0"/>
-          <w:numId w:val="2"/>
-        </w:numPr>
-        <w:spacing w:after="60"/>
-      </w:pPr>
-      <w:r>
-        <w:t xml:space="preserve">EQX ARC is a women's health program built on diagnostics and wearables</w:t>
-      </w:r>
-    </w:p>
-    <w:p>
-      <w:pPr>
-        <w:pStyle w:val="ListParagraph"/>
-        <w:numPr>
-          <w:ilvl w:val="0"/>
-          <w:numId w:val="2"/>
-        </w:numPr>
-        <w:spacing w:after="60"/>
-      </w:pPr>
-      <w:r>
-        <w:t xml:space="preserve">Next adjacencies: supplements, apparel, concierge medicine, retreats</w:t>
+        <w:t xml:space="preserve">Hyper-personalization is the #1 consumer trend (clienteling apps, AR try-ons, CRM)</w:t>
+      </w:r>
+    </w:p>
+    <w:p>
+      <w:pPr>
+        <w:pStyle w:val="ListParagraph"/>
+        <w:numPr>
+          <w:ilvl w:val="0"/>
+          <w:numId w:val="2"/>
+        </w:numPr>
+        <w:spacing w:after="60"/>
+      </w:pPr>
+      <w:r>
+        <w:rPr>
+          <w:b/>
+          <w:bCs/>
+        </w:rPr>
+        <w:t xml:space="preserve">Resale is going mainstream:</w:t>
+      </w:r>
+      <w:r>
+        <w:t xml:space="preserve"> 68% of brands offer repair or care services and 54% certified pre-owned programs. Resale is projected at </w:t>
+      </w:r>
+      <w:r>
+        <w:rPr>
+          <w:b/>
+          <w:bCs/>
+        </w:rPr>
+        <w:t xml:space="preserve">$367B by 2029</w:t>
+      </w:r>
+      <w:r>
+        <w:t xml:space="preserve">.</w:t>
+      </w:r>
+    </w:p>
+    <w:p>
+      <w:pPr>
+        <w:pStyle w:val="ListParagraph"/>
+        <w:numPr>
+          <w:ilvl w:val="0"/>
+          <w:numId w:val="2"/>
+        </w:numPr>
+        <w:spacing w:after="60"/>
+      </w:pPr>
+      <w:r>
+        <w:t xml:space="preserve">Flagship stores are becoming "theatrical" destinations with cafés, galleries, and pop-ups</w:t>
+      </w:r>
+    </w:p>
+    <w:p>
+      <w:pPr>
+        <w:pStyle w:val="ListParagraph"/>
+        <w:numPr>
+          <w:ilvl w:val="0"/>
+          <w:numId w:val="2"/>
+        </w:numPr>
+        <w:spacing w:after="60"/>
+      </w:pPr>
+      <w:r>
+        <w:t xml:space="preserve">GenAI adoption: 41% are assessing it, 41% are piloting it, and only 12% have it embedded</w:t>
+      </w:r>
+    </w:p>
+    <w:p>
+      <w:pPr>
+        <w:pStyle w:val="ListParagraph"/>
+        <w:numPr>
+          <w:ilvl w:val="0"/>
+          <w:numId w:val="2"/>
+        </w:numPr>
+        <w:spacing w:after="60"/>
+      </w:pPr>
+      <w:r>
+        <w:t xml:space="preserve">Five-year growth levers: e-commerce/DTC (25.7%), social and shoppable commerce (20%), and lifestyle extensions into </w:t>
+      </w:r>
+      <w:r>
+        <w:rPr>
+          <w:b/>
+          <w:bCs/>
+        </w:rPr>
+        <w:t xml:space="preserve">wellness</w:t>
+      </w:r>
+      <w:r>
+        <w:t xml:space="preserve">, hospitality, and home (17.9%)</w:t>
+      </w:r>
+    </w:p>
+    <w:p>
+      <w:pPr>
+        <w:pStyle w:val="ListParagraph"/>
+        <w:numPr>
+          <w:ilvl w:val="0"/>
+          <w:numId w:val="2"/>
+        </w:numPr>
+        <w:spacing w:after="60"/>
+      </w:pPr>
+      <w:r>
+        <w:t xml:space="preserve">India: luxury beauty is about </w:t>
+      </w:r>
+      <w:r>
+        <w:rPr>
+          <w:b/>
+          <w:bCs/>
+        </w:rPr>
+        <w:t xml:space="preserve">$0.8B, projected at about $4B by 2035</w:t>
+      </w:r>
+      <w:r>
+        <w:t xml:space="preserve">, and gold jewelry remains central</w:t>
       </w:r>
     </w:p>
     <w:p>
@@ -1651,7 +1650,7 @@
         <w:pStyle w:val="Heading3"/>
       </w:pPr>
       <w:r>
-        <w:t xml:space="preserve">Global Wellness Institute — Press Release</w:t>
+        <w:t xml:space="preserve">CNBC Inside Wealth — "Health is the New Luxury"</w:t>
       </w:r>
     </w:p>
     <w:p>
@@ -1664,49 +1663,207 @@
           <w:iCs/>
           <w:color w:val="595959"/>
         </w:rPr>
-        <w:t xml:space="preserve">2026; based on the headline only</w:t>
-      </w:r>
-    </w:p>
-    <w:p>
-      <w:pPr>
-        <w:pStyle w:val="ListParagraph"/>
-        <w:numPr>
-          <w:ilvl w:val="0"/>
-          <w:numId w:val="2"/>
-        </w:numPr>
-        <w:spacing w:after="60"/>
-      </w:pPr>
-      <w:r>
-        <w:t xml:space="preserve">Wellness economy of </w:t>
-      </w:r>
-      <w:r>
-        <w:rPr>
-          <w:b/>
-          <w:bCs/>
-        </w:rPr>
-        <w:t xml:space="preserve">$6.8T</w:t>
-      </w:r>
-      <w:r>
-        <w:t xml:space="preserve"> (record high), forecast at </w:t>
-      </w:r>
-      <w:r>
-        <w:rPr>
-          <w:b/>
-          <w:bCs/>
-        </w:rPr>
-        <w:t xml:space="preserve">$9.8T by 2029</w:t>
-      </w:r>
-    </w:p>
-    <w:p>
-      <w:pPr>
-        <w:pBdr>
-          <w:left w:val="single" w:color="E69138" w:sz="18" w:space="6"/>
-        </w:pBdr>
-        <w:shd w:fill="FFF4E5" w:val="clear"/>
-        <w:spacing w:after="160" w:before="80"/>
-      </w:pPr>
-      <w:r>
-        <w:t xml:space="preserve">CNBC quotes the same source as "nearly $10T by 2030," so the end year differs. Check the full release to confirm which is right.</w:t>
+        <w:t xml:space="preserve">Newsletter dated February 19, 2026</w:t>
+      </w:r>
+    </w:p>
+    <w:p>
+      <w:pPr>
+        <w:spacing w:after="120"/>
+      </w:pPr>
+      <w:r>
+        <w:rPr>
+          <w:b/>
+          <w:bCs/>
+        </w:rPr>
+        <w:t xml:space="preserve">Overview:</w:t>
+      </w:r>
+      <w:r>
+        <w:t xml:space="preserve"> In an interview, Equinox's executive chairman describes the wealthy moving their spending </w:t>
+      </w:r>
+      <w:r>
+        <w:rPr>
+          <w:b/>
+          <w:bCs/>
+        </w:rPr>
+        <w:t xml:space="preserve">from status goods to health and longevity</w:t>
+      </w:r>
+      <w:r>
+        <w:t xml:space="preserve">.</w:t>
+      </w:r>
+    </w:p>
+    <w:p>
+      <w:pPr>
+        <w:spacing w:after="60"/>
+      </w:pPr>
+      <w:r>
+        <w:rPr>
+          <w:b/>
+          <w:bCs/>
+        </w:rPr>
+        <w:t xml:space="preserve">Macro trends</w:t>
+      </w:r>
+    </w:p>
+    <w:p>
+      <w:pPr>
+        <w:pStyle w:val="ListParagraph"/>
+        <w:numPr>
+          <w:ilvl w:val="0"/>
+          <w:numId w:val="2"/>
+        </w:numPr>
+        <w:spacing w:after="60"/>
+      </w:pPr>
+      <w:r>
+        <w:rPr>
+          <w:b/>
+          <w:bCs/>
+        </w:rPr>
+        <w:t xml:space="preserve">Wellness is forecast to reach nearly $10T</w:t>
+      </w:r>
+      <w:r>
+        <w:t xml:space="preserve"> (CNBC says by 2030; GWI's own release says $9.8T by 2029). Growth rates by segment: longevity </w:t>
+      </w:r>
+      <w:r>
+        <w:rPr>
+          <w:b/>
+          <w:bCs/>
+        </w:rPr>
+        <w:t xml:space="preserve">11% a year</w:t>
+      </w:r>
+      <w:r>
+        <w:t xml:space="preserve">, wellness tourism 8%, nutrition 7%, physical activity 5%.</w:t>
+      </w:r>
+    </w:p>
+    <w:p>
+      <w:pPr>
+        <w:pStyle w:val="ListParagraph"/>
+        <w:numPr>
+          <w:ilvl w:val="0"/>
+          <w:numId w:val="2"/>
+        </w:numPr>
+        <w:spacing w:after="60"/>
+      </w:pPr>
+      <w:r>
+        <w:t xml:space="preserve">Wealthy people are aging and spending on longevity. 87% of Julius Baer's North American clients are taking steps to extend their lives.</w:t>
+      </w:r>
+    </w:p>
+    <w:p>
+      <w:pPr>
+        <w:pStyle w:val="ListParagraph"/>
+        <w:numPr>
+          <w:ilvl w:val="0"/>
+          <w:numId w:val="2"/>
+        </w:numPr>
+        <w:spacing w:after="60"/>
+      </w:pPr>
+      <w:r>
+        <w:t xml:space="preserve">Private banks are partnering with concierge medical practices</w:t>
+      </w:r>
+    </w:p>
+    <w:p>
+      <w:pPr>
+        <w:pStyle w:val="ListParagraph"/>
+        <w:numPr>
+          <w:ilvl w:val="0"/>
+          <w:numId w:val="2"/>
+        </w:numPr>
+        <w:spacing w:after="60"/>
+      </w:pPr>
+      <w:r>
+        <w:rPr>
+          <w:b/>
+          <w:bCs/>
+        </w:rPr>
+        <w:t xml:space="preserve">Other wealth trends:</w:t>
+      </w:r>
+      <w:r>
+        <w:t xml:space="preserve"> The art-loan market is about $38–45B, growing about 12% a year. Family offices managing $1B+ now spend an average of $6.6M a year to operate.</w:t>
+      </w:r>
+    </w:p>
+    <w:p>
+      <w:pPr>
+        <w:spacing w:after="60" w:before="120"/>
+      </w:pPr>
+      <w:r>
+        <w:rPr>
+          <w:b/>
+          <w:bCs/>
+        </w:rPr>
+        <w:t xml:space="preserve">Micro trends</w:t>
+      </w:r>
+    </w:p>
+    <w:p>
+      <w:pPr>
+        <w:pStyle w:val="ListParagraph"/>
+        <w:numPr>
+          <w:ilvl w:val="0"/>
+          <w:numId w:val="2"/>
+        </w:numPr>
+        <w:spacing w:after="60"/>
+      </w:pPr>
+      <w:r>
+        <w:t xml:space="preserve">Equinox Optimize: $40K a year, </w:t>
+      </w:r>
+      <w:r>
+        <w:rPr>
+          <w:b/>
+          <w:bCs/>
+        </w:rPr>
+        <w:t xml:space="preserve">waitlist of 1,000+</w:t>
+      </w:r>
+      <w:r>
+        <w:t xml:space="preserve">, twice-yearly biomarker testing through Function Health</w:t>
+      </w:r>
+    </w:p>
+    <w:p>
+      <w:pPr>
+        <w:pStyle w:val="ListParagraph"/>
+        <w:numPr>
+          <w:ilvl w:val="0"/>
+          <w:numId w:val="2"/>
+        </w:numPr>
+        <w:spacing w:after="60"/>
+      </w:pPr>
+      <w:r>
+        <w:t xml:space="preserve">Its IV drip lounge is already a "seven-figure business"</w:t>
+      </w:r>
+    </w:p>
+    <w:p>
+      <w:pPr>
+        <w:pStyle w:val="ListParagraph"/>
+        <w:numPr>
+          <w:ilvl w:val="0"/>
+          <w:numId w:val="2"/>
+        </w:numPr>
+        <w:spacing w:after="60"/>
+      </w:pPr>
+      <w:r>
+        <w:t xml:space="preserve">Hospitality is expanding into wellness: about a dozen Equinox hotels planned, including Saudi Arabia, built around sleep</w:t>
+      </w:r>
+    </w:p>
+    <w:p>
+      <w:pPr>
+        <w:pStyle w:val="ListParagraph"/>
+        <w:numPr>
+          <w:ilvl w:val="0"/>
+          <w:numId w:val="2"/>
+        </w:numPr>
+        <w:spacing w:after="60"/>
+      </w:pPr>
+      <w:r>
+        <w:t xml:space="preserve">EQX ARC is a women's health program built on diagnostics and wearables</w:t>
+      </w:r>
+    </w:p>
+    <w:p>
+      <w:pPr>
+        <w:pStyle w:val="ListParagraph"/>
+        <w:numPr>
+          <w:ilvl w:val="0"/>
+          <w:numId w:val="2"/>
+        </w:numPr>
+        <w:spacing w:after="60"/>
+      </w:pPr>
+      <w:r>
+        <w:t xml:space="preserve">Next adjacencies: supplements, apparel, concierge medicine, retreats</w:t>
       </w:r>
     </w:p>
     <w:p>
@@ -1930,7 +2087,7 @@
           </w:tcPr>
           <w:p>
             <w:r>
-              <w:t xml:space="preserve">Wellness $6.8T; longevity +11% a year; luxury brands extending into wellness</w:t>
+              <w:t xml:space="preserve">Wellness $6.8T (2024) → $9.8T (2029); mental wellness +12.4% a year; longevity +11% a year</w:t>
             </w:r>
           </w:p>
         </w:tc>
@@ -2326,7 +2483,7 @@
           </w:tcPr>
           <w:p>
             <w:r>
-              <w:t xml:space="preserve">Highest margin confidence; Equinox hotel in Saudi Arabia</w:t>
+              <w:t xml:space="preserve">Highest margin confidence; #2 fastest-growing wellness region (7.2% a year); Equinox hotel in Saudi Arabia</w:t>
             </w:r>
           </w:p>
         </w:tc>

</xml_diff>

<commit_message>
Add full GWI press release details to research summary
Co-Authored-By: Claude Opus 5.5 <noreply@anthropic.com>
Claude-Session: https://claude.ai/code/session_01WN3THeWZQW2o4KJoNbsMAq
</commit_message>
<xml_diff>
--- a/Beauty_Luxury_Wellness_Research_Summary.docx
+++ b/Beauty_Luxury_Wellness_Research_Summary.docx
@@ -594,7 +594,7 @@
         <w:t xml:space="preserve">Source notes:</w:t>
       </w:r>
       <w:r>
-        <w:t xml:space="preserve"> The Global Wellness Institute press release could not be opened directly; its figures were confirmed through web search results from GWI's own pages (press release, blog and report page). The CNBC file is a forwarded newsletter that also covers art lending and family offices; those sections are summarized briefly as wealth trends.</w:t>
+        <w:t xml:space="preserve"> The Global Wellness Institute figures come from a PDF of its November 19, 2025 press release. The CNBC file is a forwarded newsletter that also covers art lending and family offices; those sections are summarized briefly as wealth trends.</w:t>
       </w:r>
     </w:p>
     <w:p>
@@ -1090,7 +1090,7 @@
           <w:iCs/>
           <w:color w:val="595959"/>
         </w:rPr>
-        <w:t xml:space="preserve">Press release, November 2025</w:t>
+        <w:t xml:space="preserve">Press release, Miami, November 19, 2025</w:t>
       </w:r>
     </w:p>
     <w:p>
@@ -1125,24 +1125,24 @@
         <w:t xml:space="preserve">7.9% from 2023</w:t>
       </w:r>
       <w:r>
-        <w:t xml:space="preserve">, and has </w:t>
-      </w:r>
-      <w:r>
-        <w:rPr>
-          <w:b/>
-          <w:bCs/>
-        </w:rPr>
-        <w:t xml:space="preserve">doubled since 2013</w:t>
-      </w:r>
-      <w:r>
-        <w:t xml:space="preserve">. GWI forecasts </w:t>
-      </w:r>
-      <w:r>
-        <w:rPr>
-          <w:b/>
-          <w:bCs/>
-        </w:rPr>
-        <w:t xml:space="preserve">7.6% annual growth to about $9.8T in 2029</w:t>
+        <w:t xml:space="preserve"> and about </w:t>
+      </w:r>
+      <w:r>
+        <w:rPr>
+          <w:b/>
+          <w:bCs/>
+        </w:rPr>
+        <w:t xml:space="preserve">double its 2013 size</w:t>
+      </w:r>
+      <w:r>
+        <w:t xml:space="preserve">. GWI says the market is "officially beyond pandemic recovery" and forecasts </w:t>
+      </w:r>
+      <w:r>
+        <w:rPr>
+          <w:b/>
+          <w:bCs/>
+        </w:rPr>
+        <w:t xml:space="preserve">7.6% annual growth to $9.8T by 2029</w:t>
       </w:r>
       <w:r>
         <w:t xml:space="preserve">.</w:t>
@@ -1194,10 +1194,10 @@
           <w:b/>
           <w:bCs/>
         </w:rPr>
-        <w:t xml:space="preserve">Scale:</w:t>
-      </w:r>
-      <w:r>
-        <w:t xml:space="preserve"> almost </w:t>
+        <w:t xml:space="preserve">Bigger than other mega-industries:</w:t>
+      </w:r>
+      <w:r>
+        <w:t xml:space="preserve"> wellness ($6.8T) is larger than tourism ($5T), the green economy ($5.1T) and IT ($5.3T). It is almost </w:t>
       </w:r>
       <w:r>
         <w:rPr>
@@ -1217,7 +1217,54 @@
         <w:t xml:space="preserve">60% of all global health spending</w:t>
       </w:r>
       <w:r>
-        <w:t xml:space="preserve"> ($11.2T)</w:t>
+        <w:t xml:space="preserve"> ($11.2T).</w:t>
+      </w:r>
+    </w:p>
+    <w:p>
+      <w:pPr>
+        <w:pStyle w:val="ListParagraph"/>
+        <w:numPr>
+          <w:ilvl w:val="0"/>
+          <w:numId w:val="2"/>
+        </w:numPr>
+        <w:spacing w:after="60"/>
+      </w:pPr>
+      <w:r>
+        <w:rPr>
+          <w:b/>
+          <w:bCs/>
+        </w:rPr>
+        <w:t xml:space="preserve">Growing share of the world economy:</w:t>
+      </w:r>
+      <w:r>
+        <w:t xml:space="preserve"> from 5.7% of global GDP in 2019 to a projected </w:t>
+      </w:r>
+      <w:r>
+        <w:rPr>
+          <w:b/>
+          <w:bCs/>
+        </w:rPr>
+        <w:t xml:space="preserve">7.1% by 2029</w:t>
+      </w:r>
+    </w:p>
+    <w:p>
+      <w:pPr>
+        <w:pStyle w:val="ListParagraph"/>
+        <w:numPr>
+          <w:ilvl w:val="0"/>
+          <w:numId w:val="2"/>
+        </w:numPr>
+        <w:spacing w:after="60"/>
+      </w:pPr>
+      <w:r>
+        <w:rPr>
+          <w:b/>
+          <w:bCs/>
+        </w:rPr>
+        <w:t xml:space="preserve">What's driving it:</w:t>
+      </w:r>
+      <w:r>
+        <w:t xml:space="preserve"> an aging population, rising chronic disease and mental unwellness, and consumers focusing on prevention and longevity</w:t>
       </w:r>
     </w:p>
     <w:p>
@@ -1237,7 +1284,27 @@
         <w:t xml:space="preserve">Fastest-growing regions (2019–2024):</w:t>
       </w:r>
       <w:r>
-        <w:t xml:space="preserve"> North America (7.9% a year), Middle East–North Africa (7.2%) and Europe (6.3%), which also recovered most strongly after the pandemic</w:t>
+        <w:t xml:space="preserve"> North America (7.9% a year), Middle East–North Africa (7.2%) and Europe (6.3%)</w:t>
+      </w:r>
+    </w:p>
+    <w:p>
+      <w:pPr>
+        <w:pStyle w:val="ListParagraph"/>
+        <w:numPr>
+          <w:ilvl w:val="0"/>
+          <w:numId w:val="2"/>
+        </w:numPr>
+        <w:spacing w:after="60"/>
+      </w:pPr>
+      <w:r>
+        <w:rPr>
+          <w:b/>
+          <w:bCs/>
+        </w:rPr>
+        <w:t xml:space="preserve">Spending per person is very uneven:</w:t>
+      </w:r>
+      <w:r>
+        <w:t xml:space="preserve"> North America $6,029, Europe $1,876, Latin America–Caribbean $607, Asia $471, Middle East–North Africa $339</w:t>
       </w:r>
     </w:p>
     <w:p>
@@ -1306,10 +1373,169 @@
           <w:b/>
           <w:bCs/>
         </w:rPr>
+        <w:t xml:space="preserve">Mental wellness:</w:t>
+      </w:r>
+      <w:r>
+        <w:t xml:space="preserve"> the US market ($125B) is by far the largest; within it, meditation and mindfulness grew 18.9% a year and sleep 12.6%</w:t>
+      </w:r>
+    </w:p>
+    <w:p>
+      <w:pPr>
+        <w:pStyle w:val="ListParagraph"/>
+        <w:numPr>
+          <w:ilvl w:val="0"/>
+          <w:numId w:val="2"/>
+        </w:numPr>
+        <w:spacing w:after="60"/>
+      </w:pPr>
+      <w:r>
+        <w:rPr>
+          <w:b/>
+          <w:bCs/>
+        </w:rPr>
+        <w:t xml:space="preserve">Travel-based wellness bounced back strongly:</w:t>
+      </w:r>
+      <w:r>
+        <w:t xml:space="preserve"> wellness tourism grew 13.8%, spas 14.6% and thermal/mineral springs 11.1%</w:t>
+      </w:r>
+    </w:p>
+    <w:p>
+      <w:pPr>
+        <w:pStyle w:val="ListParagraph"/>
+        <w:numPr>
+          <w:ilvl w:val="0"/>
+          <w:numId w:val="2"/>
+        </w:numPr>
+        <w:spacing w:after="60"/>
+      </w:pPr>
+      <w:r>
+        <w:rPr>
+          <w:b/>
+          <w:bCs/>
+        </w:rPr>
+        <w:t xml:space="preserve">Steady, mature sectors:</w:t>
+      </w:r>
+      <w:r>
+        <w:t xml:space="preserve"> personal care &amp; beauty; healthy eating, nutrition &amp; weight loss; physical activity; and traditional &amp; complementary medicine</w:t>
+      </w:r>
+    </w:p>
+    <w:p>
+      <w:pPr>
+        <w:pStyle w:val="ListParagraph"/>
+        <w:numPr>
+          <w:ilvl w:val="0"/>
+          <w:numId w:val="2"/>
+        </w:numPr>
+        <w:spacing w:after="60"/>
+      </w:pPr>
+      <w:r>
+        <w:rPr>
+          <w:b/>
+          <w:bCs/>
+        </w:rPr>
+        <w:t xml:space="preserve">Fitness tech</w:t>
+      </w:r>
+      <w:r>
+        <w:t xml:space="preserve"> reached $86B, while weight-loss services shrank in 2024</w:t>
+      </w:r>
+    </w:p>
+    <w:p>
+      <w:pPr>
+        <w:pStyle w:val="ListParagraph"/>
+        <w:numPr>
+          <w:ilvl w:val="0"/>
+          <w:numId w:val="2"/>
+        </w:numPr>
+        <w:spacing w:after="60"/>
+      </w:pPr>
+      <w:r>
+        <w:rPr>
+          <w:b/>
+          <w:bCs/>
+        </w:rPr>
+        <w:t xml:space="preserve">Workplace wellness is the only shrinking sector</w:t>
+      </w:r>
+      <w:r>
+        <w:t xml:space="preserve"> (down 1.5% from 2023 to 2024), as employers move away from formal programs and more people work remotely or in gig jobs</w:t>
+      </w:r>
+    </w:p>
+    <w:p>
+      <w:pPr>
+        <w:pStyle w:val="ListParagraph"/>
+        <w:numPr>
+          <w:ilvl w:val="0"/>
+          <w:numId w:val="2"/>
+        </w:numPr>
+        <w:spacing w:after="60"/>
+      </w:pPr>
+      <w:r>
+        <w:rPr>
+          <w:b/>
+          <w:bCs/>
+        </w:rPr>
+        <w:t xml:space="preserve">Fastest-growing sectors through 2029:</w:t>
+      </w:r>
+      <w:r>
+        <w:t xml:space="preserve"> wellness real estate (about 15% a year), traditional &amp; complementary medicine (10.8%, including Ayurveda, herbal supplements, and longevity and biohacking treatments like infrared light therapy), thermal/mineral springs (10%), mental wellness (10.1%) and wellness tourism (9.1%)</w:t>
+      </w:r>
+    </w:p>
+    <w:p>
+      <w:pPr>
+        <w:pStyle w:val="ListParagraph"/>
+        <w:numPr>
+          <w:ilvl w:val="0"/>
+          <w:numId w:val="2"/>
+        </w:numPr>
+        <w:spacing w:after="60"/>
+      </w:pPr>
+      <w:r>
+        <w:rPr>
+          <w:b/>
+          <w:bCs/>
+        </w:rPr>
+        <w:t xml:space="preserve">Personalized medicine</w:t>
+      </w:r>
+      <w:r>
+        <w:t xml:space="preserve"> ($147B) is forecast to grow 9.3% a year as longevity-focused consumers turn to diagnostics</w:t>
+      </w:r>
+    </w:p>
+    <w:p>
+      <w:pPr>
+        <w:pStyle w:val="ListParagraph"/>
+        <w:numPr>
+          <w:ilvl w:val="0"/>
+          <w:numId w:val="2"/>
+        </w:numPr>
+        <w:spacing w:after="60"/>
+      </w:pPr>
+      <w:r>
+        <w:rPr>
+          <w:b/>
+          <w:bCs/>
+        </w:rPr>
         <w:t xml:space="preserve">Six sectors will pass $1T each by 2029:</w:t>
       </w:r>
       <w:r>
         <w:t xml:space="preserve"> personal care &amp; beauty; healthy eating, nutrition &amp; weight loss; physical activity; wellness tourism; wellness real estate; and traditional &amp; complementary medicine</w:t>
+      </w:r>
+    </w:p>
+    <w:p>
+      <w:pPr>
+        <w:pBdr>
+          <w:left w:val="single" w:color="E69138" w:sz="18" w:space="6"/>
+        </w:pBdr>
+        <w:shd w:fill="FFF4E5" w:val="clear"/>
+        <w:spacing w:after="160" w:before="80"/>
+      </w:pPr>
+      <w:r>
+        <w:rPr>
+          <w:b/>
+          <w:bCs/>
+        </w:rPr>
+        <w:t xml:space="preserve">Note:</w:t>
+      </w:r>
+      <w:r>
+        <w:t xml:space="preserve"> The release gives two different forecasts for wellness real estate growth to 2029: 15.8% in one place and 15.2% in another. Check the full report for the correct figure.</w:t>
       </w:r>
     </w:p>
     <w:p>
@@ -2087,7 +2313,7 @@
           </w:tcPr>
           <w:p>
             <w:r>
-              <w:t xml:space="preserve">Wellness $6.8T (2024) → $9.8T (2029); mental wellness +12.4% a year; longevity +11% a year</w:t>
+              <w:t xml:space="preserve">Wellness $6.8T (2024) → $9.8T (2029); sleep +12.6% a year; personalized medicine +9.3% a year; longevity +11% a year</w:t>
             </w:r>
           </w:p>
         </w:tc>
@@ -2187,7 +2413,7 @@
           </w:tcPr>
           <w:p>
             <w:r>
-              <w:t xml:space="preserve">Travel is the #1 luxury growth category; "health is the new luxury"</w:t>
+              <w:t xml:space="preserve">Travel is the #1 luxury growth category; wellness tourism +13.8% a year; "health is the new luxury"</w:t>
             </w:r>
           </w:p>
         </w:tc>

</xml_diff>